<commit_message>
feat(demo): P23-T07 bank-grade collection notice rewrite
Rate change and overdue collection templates with regulatory emphasis, disclaimer footers, and rich structured bindings; masters regenerated.

Co-authored-by: Cursor <cursoragent@cursor.com>
</commit_message>
<xml_diff>
--- a/deploy/demo-collection/assets/overdue-collection-master.docx
+++ b/deploy/demo-collection/assets/overdue-collection-master.docx
@@ -16,14 +16,182 @@
     </w:p>
     <w:p>
       <w:r>
-        <w:t>{{anchor:OVERDUE_COLLECTION_BODY}}</w:t>
+        <w:t>{{anchor:OCN_PARTIES}}</w:t>
+      </w:r>
+    </w:p>
+    <w:p>
+      <w:pPr>
+        <w:sectPr>
+          <w:type w:val="nextPage"/>
+        </w:sectPr>
+      </w:pPr>
+    </w:p>
+    <w:p>
+      <w:pPr>
+        <w:jc w:val="left"/>
+      </w:pPr>
+      <w:r>
+        <w:rPr>
+          <w:b w:val="on"/>
+          <w:sz w:val="24"/>
+        </w:rPr>
+        <w:t>Overdue Balance Notice</w:t>
+      </w:r>
+    </w:p>
+    <w:p>
+      <w:r>
+        <w:t>{{anchor:OCN_ARREARS}}</w:t>
+      </w:r>
+    </w:p>
+    <w:p>
+      <w:pPr>
+        <w:sectPr>
+          <w:type w:val="nextPage"/>
+        </w:sectPr>
+      </w:pPr>
+    </w:p>
+    <w:p>
+      <w:pPr>
+        <w:jc w:val="left"/>
+      </w:pPr>
+      <w:r>
+        <w:rPr>
+          <w:b w:val="on"/>
+          <w:sz w:val="24"/>
+        </w:rPr>
+        <w:t>Regulatory Notice</w:t>
+      </w:r>
+    </w:p>
+    <w:p>
+      <w:r>
+        <w:t>{{anchor:OCN_REGULATORY}}</w:t>
+      </w:r>
+    </w:p>
+    <w:p>
+      <w:pPr>
+        <w:sectPr>
+          <w:type w:val="nextPage"/>
+        </w:sectPr>
+      </w:pPr>
+    </w:p>
+    <w:p>
+      <w:pPr>
+        <w:jc w:val="left"/>
+      </w:pPr>
+      <w:r>
+        <w:rPr>
+          <w:b w:val="on"/>
+          <w:sz w:val="24"/>
+        </w:rPr>
+        <w:t>Repayment Options</w:t>
+      </w:r>
+    </w:p>
+    <w:p>
+      <w:r>
+        <w:t>{{anchor:OCN_REPAYMENT}}</w:t>
+      </w:r>
+    </w:p>
+    <w:p>
+      <w:pPr>
+        <w:sectPr>
+          <w:type w:val="nextPage"/>
+        </w:sectPr>
+      </w:pPr>
+    </w:p>
+    <w:p>
+      <w:pPr>
+        <w:jc w:val="left"/>
+      </w:pPr>
+      <w:r>
+        <w:rPr>
+          <w:b w:val="on"/>
+          <w:sz w:val="24"/>
+        </w:rPr>
+        <w:t>Consequences of Non-Payment</w:t>
+      </w:r>
+    </w:p>
+    <w:p>
+      <w:r>
+        <w:t>{{anchor:OCN_CONSEQUENCES}}</w:t>
+      </w:r>
+    </w:p>
+    <w:p>
+      <w:pPr>
+        <w:sectPr>
+          <w:type w:val="nextPage"/>
+        </w:sectPr>
+      </w:pPr>
+    </w:p>
+    <w:p>
+      <w:pPr>
+        <w:jc w:val="left"/>
+      </w:pPr>
+      <w:r>
+        <w:rPr>
+          <w:b w:val="on"/>
+          <w:sz w:val="24"/>
+        </w:rPr>
+        <w:t>Support and Complaints</w:t>
+      </w:r>
+    </w:p>
+    <w:p>
+      <w:r>
+        <w:t>{{anchor:OCN_SUPPORT}}</w:t>
+      </w:r>
+    </w:p>
+    <w:p>
+      <w:pPr>
+        <w:sectPr>
+          <w:type w:val="nextPage"/>
+        </w:sectPr>
+      </w:pPr>
+    </w:p>
+    <w:p>
+      <w:pPr>
+        <w:jc w:val="left"/>
+      </w:pPr>
+      <w:r>
+        <w:rPr>
+          <w:b w:val="on"/>
+          <w:sz w:val="24"/>
+        </w:rPr>
+        <w:t>Authorised Signatory</w:t>
+      </w:r>
+    </w:p>
+    <w:p>
+      <w:r>
+        <w:t>{{anchor:OCN_SIGNATURE}}</w:t>
+      </w:r>
+    </w:p>
+    <w:p>
+      <w:pPr>
+        <w:sectPr>
+          <w:type w:val="nextPage"/>
+        </w:sectPr>
+      </w:pPr>
+    </w:p>
+    <w:p>
+      <w:pPr>
+        <w:jc w:val="left"/>
+      </w:pPr>
+      <w:r>
+        <w:rPr>
+          <w:b w:val="on"/>
+          <w:sz w:val="24"/>
+        </w:rPr>
+        <w:t>Important Information</w:t>
+      </w:r>
+    </w:p>
+    <w:p>
+      <w:r>
+        <w:t>{{anchor:OCN_DISCLAIMER}}</w:t>
       </w:r>
     </w:p>
     <w:sectPr>
-      <main:headerReference xmlns:main="http://schemas.openxmlformats.org/wordprocessingml/2006/main" xmlns:rel="http://schemas.openxmlformats.org/officeDocument/2006/relationships" main:type="default" rel:id="rId2"/>
-      <main:footerReference xmlns:main="http://schemas.openxmlformats.org/wordprocessingml/2006/main" xmlns:rel="http://schemas.openxmlformats.org/officeDocument/2006/relationships" main:type="default" rel:id="rId3"/>
+      <main:headerReference xmlns:main="http://schemas.openxmlformats.org/wordprocessingml/2006/main" xmlns:rel="http://schemas.openxmlformats.org/officeDocument/2006/relationships" main:type="default" rel:id="rId3"/>
+      <main:footerReference xmlns:main="http://schemas.openxmlformats.org/wordprocessingml/2006/main" xmlns:rel="http://schemas.openxmlformats.org/officeDocument/2006/relationships" main:type="default" rel:id="rId4"/>
       <main:pgSz xmlns:main="http://schemas.openxmlformats.org/wordprocessingml/2006/main" main:w="11906" main:h="16838"/>
-      <main:pgMar xmlns:main="http://schemas.openxmlformats.org/wordprocessingml/2006/main" main:top="1440" main:bottom="1440" main:left="1701" main:right="1276" main:header="708" main:footer="708" main:gutter="0"/>
+      <main:pgMar xmlns:main="http://schemas.openxmlformats.org/wordprocessingml/2006/main" main:top="1440" main:bottom="1440" main:left="1440" main:right="1440" main:header="708" main:footer="708" main:gutter="0"/>
     </w:sectPr>
   </w:body>
 </w:document>
@@ -32,8 +200,15 @@
 <file path=word/footer1.xml><?xml version="1.0" encoding="utf-8"?>
 <w:ftr xmlns:w="http://schemas.openxmlformats.org/wordprocessingml/2006/main">
   <w:p>
-    <w:r>
-      <w:t>Regulatory collection notice — FCA CONC principles apply</w:t>
+    <w:pPr>
+      <w:jc w:val="left"/>
+    </w:pPr>
+    <w:r>
+      <w:rPr>
+        <w:sz w:val="14"/>
+        <w:color w:val="666666"/>
+      </w:rPr>
+      <w:t>Regulatory collection notice — FCA CONC principles apply | Meridian Retail Banking, PO Box 1200, London EC2N 1DB</w:t>
     </w:r>
   </w:p>
   <w:p>
@@ -91,8 +266,29 @@
 <file path=word/header1.xml><?xml version="1.0" encoding="utf-8"?>
 <w:hdr xmlns:w="http://schemas.openxmlformats.org/wordprocessingml/2006/main">
   <w:p>
-    <w:r>
+    <w:pPr>
+      <w:jc w:val="left"/>
+    </w:pPr>
+    <w:r>
+      <w:rPr>
+        <w:b w:val="on"/>
+        <w:sz w:val="18"/>
+        <w:color w:val="003366"/>
+      </w:rPr>
       <w:t>Meridian Retail Banking — Collections &amp; Recoveries</w:t>
+    </w:r>
+  </w:p>
+  <w:p>
+    <w:pPr>
+      <w:jc w:val="right"/>
+    </w:pPr>
+    <w:r>
+      <w:rPr>
+        <w:b w:val="on"/>
+        <w:sz w:val="14"/>
+        <w:color w:val="990000"/>
+      </w:rPr>
+      <w:t>IMPORTANT — PLEASE READ CAREFULLY</w:t>
     </w:r>
   </w:p>
 </w:hdr>
@@ -107,7 +303,7 @@
         <w:sz w:val="22"/>
         <w:szCs w:val="22"/>
         <w:color w:val="000000"/>
-        <w:lang w:val="en-US"/>
+        <w:lang w:val="en-US" w:bidi="en-US"/>
       </w:rPr>
     </w:rPrDefault>
     <w:pPrDefault>
@@ -125,5 +321,92 @@
       <w:lang w:val="en-US"/>
     </w:rPr>
   </w:style>
+  <w:style w:type="paragraph" w:styleId="Heading1">
+    <w:name w:val="Heading1"/>
+    <w:qFormat/>
+    <w:rPr>
+      <w:sz w:val="32"/>
+      <w:rFonts w:ascii="Cambria" w:hAnsi="Cambria" w:cs="Cambria"/>
+      <w:b/>
+    </w:rPr>
+  </w:style>
+  <w:style w:type="paragraph" w:styleId="Heading2">
+    <w:name w:val="Heading2"/>
+    <w:qFormat/>
+    <w:rPr>
+      <w:sz w:val="28"/>
+      <w:rFonts w:ascii="Cambria" w:hAnsi="Cambria" w:cs="Cambria"/>
+      <w:b/>
+    </w:rPr>
+  </w:style>
+  <w:style w:type="paragraph" w:styleId="Heading3">
+    <w:name w:val="Heading3"/>
+    <w:qFormat/>
+    <w:rPr>
+      <w:sz w:val="24"/>
+      <w:rFonts w:ascii="Cambria" w:hAnsi="Cambria" w:cs="Cambria"/>
+      <w:b/>
+    </w:rPr>
+  </w:style>
+  <w:style w:type="paragraph" w:styleId="ClauseBody">
+    <w:name w:val="ClauseBody"/>
+    <w:qFormat/>
+    <w:rPr>
+      <w:sz w:val="20"/>
+      <w:rFonts w:ascii="Calibri" w:hAnsi="Calibri" w:cs="Calibri"/>
+    </w:rPr>
+  </w:style>
+  <w:style w:type="paragraph" w:styleId="DefinedTerm">
+    <w:name w:val="DefinedTerm"/>
+    <w:qFormat/>
+    <w:rPr>
+      <w:sz w:val="20"/>
+      <w:rFonts w:ascii="Calibri" w:hAnsi="Calibri" w:cs="Calibri"/>
+      <w:b/>
+    </w:rPr>
+  </w:style>
+  <w:style w:type="paragraph" w:styleId="TableHeader">
+    <w:name w:val="TableHeader"/>
+    <w:qFormat/>
+    <w:rPr>
+      <w:sz w:val="20"/>
+      <w:rFonts w:ascii="Calibri" w:hAnsi="Calibri" w:cs="Calibri"/>
+      <w:b/>
+    </w:rPr>
+  </w:style>
+  <w:style w:type="paragraph" w:styleId="ScheduleTitle">
+    <w:name w:val="ScheduleTitle"/>
+    <w:qFormat/>
+    <w:rPr>
+      <w:sz w:val="26"/>
+      <w:rFonts w:ascii="Cambria" w:hAnsi="Cambria" w:cs="Cambria"/>
+      <w:b/>
+    </w:rPr>
+  </w:style>
+  <w:style w:type="paragraph" w:styleId="SignatureBlock">
+    <w:name w:val="SignatureBlock"/>
+    <w:qFormat/>
+    <w:rPr>
+      <w:sz w:val="20"/>
+      <w:rFonts w:ascii="Calibri" w:hAnsi="Calibri" w:cs="Calibri"/>
+    </w:rPr>
+  </w:style>
+  <w:style w:type="paragraph" w:styleId="RegulatoryEmphasis">
+    <w:name w:val="RegulatoryEmphasis"/>
+    <w:qFormat/>
+    <w:rPr>
+      <w:sz w:val="20"/>
+      <w:rFonts w:ascii="Calibri" w:hAnsi="Calibri" w:cs="Calibri"/>
+      <w:b/>
+    </w:rPr>
+  </w:style>
+  <w:style w:type="paragraph" w:styleId="DisclaimerBody">
+    <w:name w:val="DisclaimerBody"/>
+    <w:qFormat/>
+    <w:rPr>
+      <w:sz w:val="16"/>
+      <w:rFonts w:ascii="Calibri" w:hAnsi="Calibri" w:cs="Calibri"/>
+    </w:rPr>
+  </w:style>
 </w:styles>
 </file>
</xml_diff>